<commit_message>
archive(2024-08-02): import full PDF + DOCX
Source chronology: 2024-08-02T17:46:24+09:00 (pdf_creation_date).
Original bytes are preserved; commit timestamps record the actual import.
Paired files have identical complete normalized body text.

Original source names:
- CV 240803 - Sangeon Jeon.pdf
- CV 240803 - Sangeon Jeon.docx
</commit_message>
<xml_diff>
--- a/reference-private/CV-Resume/Sangeon-Jeon-Resume-Full.docx
+++ b/reference-private/CV-Resume/Sangeon-Jeon-Resume-Full.docx
@@ -915,50 +915,87 @@
           <w:iCs/>
           <w:sz w:val="20"/>
           <w:szCs w:val="20"/>
-          <w:lang w:eastAsia="ko-KR"/>
-        </w:rPr>
-      </w:pPr>
-      <w:r>
-        <w:rPr>
-          <w:rFonts w:asciiTheme="minorHAnsi" w:hAnsiTheme="minorHAnsi" w:cs="Arial" w:hint="eastAsia"/>
-          <w:b/>
-          <w:iCs/>
-          <w:sz w:val="20"/>
-          <w:szCs w:val="20"/>
-          <w:lang w:eastAsia="ko-KR"/>
-        </w:rPr>
-        <w:t>G</w:t>
-      </w:r>
-      <w:r>
-        <w:rPr>
-          <w:rFonts w:asciiTheme="minorHAnsi" w:hAnsiTheme="minorHAnsi" w:cs="Arial"/>
-          <w:b/>
-          <w:iCs/>
-          <w:sz w:val="20"/>
-          <w:szCs w:val="20"/>
-          <w:lang w:eastAsia="ko-KR"/>
-        </w:rPr>
-        <w:t xml:space="preserve">eorgia Institute of Technology </w:t>
-      </w:r>
-      <w:r>
-        <w:rPr>
-          <w:rFonts w:asciiTheme="minorHAnsi" w:hAnsiTheme="minorHAnsi" w:cs="Arial"/>
-          <w:b/>
-          <w:iCs/>
-          <w:sz w:val="20"/>
-          <w:szCs w:val="20"/>
-        </w:rPr>
-        <w:t xml:space="preserve">| </w:t>
-      </w:r>
-      <w:r>
-        <w:rPr>
-          <w:rFonts w:asciiTheme="minorHAnsi" w:hAnsiTheme="minorHAnsi" w:cs="Arial"/>
-          <w:b/>
-          <w:iCs/>
-          <w:sz w:val="20"/>
-          <w:szCs w:val="20"/>
-        </w:rPr>
-        <w:t>Atlanta, GA</w:t>
+        </w:rPr>
+      </w:pPr>
+      <w:r>
+        <w:rPr>
+          <w:rFonts w:asciiTheme="minorHAnsi" w:hAnsiTheme="minorHAnsi" w:cs="Arial"/>
+          <w:b/>
+          <w:iCs/>
+          <w:sz w:val="20"/>
+          <w:szCs w:val="20"/>
+        </w:rPr>
+        <w:t>Korea Advanced Institute of Science and Technology</w:t>
+      </w:r>
+      <w:r>
+        <w:rPr>
+          <w:rFonts w:asciiTheme="minorHAnsi" w:hAnsiTheme="minorHAnsi" w:cs="Arial"/>
+          <w:b/>
+          <w:iCs/>
+          <w:sz w:val="20"/>
+          <w:szCs w:val="20"/>
+        </w:rPr>
+        <w:t xml:space="preserve"> | </w:t>
+      </w:r>
+      <w:r>
+        <w:rPr>
+          <w:rFonts w:asciiTheme="minorHAnsi" w:hAnsiTheme="minorHAnsi" w:cs="Arial"/>
+          <w:b/>
+          <w:iCs/>
+          <w:sz w:val="20"/>
+          <w:szCs w:val="20"/>
+        </w:rPr>
+        <w:t>Daejeon</w:t>
+      </w:r>
+      <w:r>
+        <w:rPr>
+          <w:rFonts w:asciiTheme="minorHAnsi" w:hAnsiTheme="minorHAnsi" w:cs="Arial"/>
+          <w:b/>
+          <w:iCs/>
+          <w:sz w:val="20"/>
+          <w:szCs w:val="20"/>
+        </w:rPr>
+        <w:t xml:space="preserve">, </w:t>
+      </w:r>
+      <w:r>
+        <w:rPr>
+          <w:rFonts w:asciiTheme="minorHAnsi" w:hAnsiTheme="minorHAnsi" w:cs="Arial"/>
+          <w:b/>
+          <w:iCs/>
+          <w:sz w:val="20"/>
+          <w:szCs w:val="20"/>
+        </w:rPr>
+        <w:t>South Korea</w:t>
+      </w:r>
+      <w:r>
+        <w:rPr>
+          <w:rFonts w:asciiTheme="minorHAnsi" w:hAnsiTheme="minorHAnsi" w:cs="Arial"/>
+          <w:i/>
+          <w:iCs/>
+          <w:sz w:val="20"/>
+          <w:szCs w:val="20"/>
+        </w:rPr>
+        <w:t xml:space="preserve"> </w:t>
+      </w:r>
+      <w:r>
+        <w:rPr>
+          <w:rFonts w:asciiTheme="minorHAnsi" w:hAnsiTheme="minorHAnsi" w:cs="Arial"/>
+          <w:i/>
+          <w:iCs/>
+          <w:sz w:val="20"/>
+          <w:szCs w:val="20"/>
+        </w:rPr>
+        <w:tab/>
+      </w:r>
+      <w:r>
+        <w:rPr>
+          <w:rFonts w:asciiTheme="minorHAnsi" w:hAnsiTheme="minorHAnsi" w:cs="Arial"/>
+          <w:i/>
+          <w:iCs/>
+          <w:sz w:val="20"/>
+          <w:szCs w:val="20"/>
+        </w:rPr>
+        <w:tab/>
       </w:r>
     </w:p>
     <w:p>
@@ -987,27 +1024,51 @@
           <w:sz w:val="20"/>
           <w:szCs w:val="20"/>
         </w:rPr>
-        <w:t>Senior</w:t>
-      </w:r>
-      <w:r>
-        <w:rPr>
-          <w:rFonts w:asciiTheme="minorHAnsi" w:hAnsiTheme="minorHAnsi" w:cs="Arial"/>
-          <w:b/>
-          <w:iCs/>
-          <w:sz w:val="20"/>
-          <w:szCs w:val="20"/>
-        </w:rPr>
-        <w:t xml:space="preserve"> Design Project: </w:t>
-      </w:r>
-      <w:r>
-        <w:rPr>
-          <w:rFonts w:asciiTheme="minorHAnsi" w:hAnsiTheme="minorHAnsi" w:cs="Arial"/>
-          <w:b/>
-          <w:iCs/>
-          <w:sz w:val="20"/>
-          <w:szCs w:val="20"/>
-        </w:rPr>
-        <w:t>Plant Physiology</w:t>
+        <w:t>KAIST Maker-a-thon (Topic: Item for the Elderly Living Alone)</w:t>
+      </w:r>
+      <w:r>
+        <w:rPr>
+          <w:rFonts w:asciiTheme="minorHAnsi" w:hAnsiTheme="minorHAnsi" w:cs="Arial"/>
+          <w:b/>
+          <w:iCs/>
+          <w:sz w:val="20"/>
+          <w:szCs w:val="20"/>
+        </w:rPr>
+        <w:t xml:space="preserve"> [</w:t>
+      </w:r>
+      <w:hyperlink r:id="rId8" w:history="1">
+        <w:r>
+          <w:rPr>
+            <w:rStyle w:val="a3"/>
+            <w:rFonts w:asciiTheme="minorHAnsi" w:hAnsiTheme="minorHAnsi" w:cs="Arial"/>
+            <w:b/>
+            <w:iCs/>
+            <w:sz w:val="20"/>
+            <w:szCs w:val="20"/>
+          </w:rPr>
+          <w:t>lin</w:t>
+        </w:r>
+        <w:r>
+          <w:rPr>
+            <w:rStyle w:val="a3"/>
+            <w:rFonts w:asciiTheme="minorHAnsi" w:hAnsiTheme="minorHAnsi" w:cs="Arial"/>
+            <w:b/>
+            <w:iCs/>
+            <w:sz w:val="20"/>
+            <w:szCs w:val="20"/>
+          </w:rPr>
+          <w:t>k</w:t>
+        </w:r>
+      </w:hyperlink>
+      <w:r>
+        <w:rPr>
+          <w:rFonts w:asciiTheme="minorHAnsi" w:hAnsiTheme="minorHAnsi" w:cs="Arial"/>
+          <w:b/>
+          <w:iCs/>
+          <w:sz w:val="20"/>
+          <w:szCs w:val="20"/>
+        </w:rPr>
+        <w:t>]</w:t>
       </w:r>
       <w:r>
         <w:rPr>
@@ -1047,6 +1108,364 @@
           <w:sz w:val="20"/>
           <w:szCs w:val="20"/>
         </w:rPr>
+        <w:t>Summer</w:t>
+      </w:r>
+      <w:r>
+        <w:rPr>
+          <w:rFonts w:asciiTheme="minorHAnsi" w:hAnsiTheme="minorHAnsi" w:cs="Arial"/>
+          <w:i/>
+          <w:iCs/>
+          <w:sz w:val="20"/>
+          <w:szCs w:val="20"/>
+        </w:rPr>
+        <w:t xml:space="preserve"> 20</w:t>
+      </w:r>
+      <w:r>
+        <w:rPr>
+          <w:rFonts w:asciiTheme="minorHAnsi" w:hAnsiTheme="minorHAnsi" w:cs="Arial"/>
+          <w:i/>
+          <w:iCs/>
+          <w:sz w:val="20"/>
+          <w:szCs w:val="20"/>
+        </w:rPr>
+        <w:t>24</w:t>
+      </w:r>
+    </w:p>
+    <w:p>
+      <w:pPr>
+        <w:pStyle w:val="ac"/>
+        <w:numPr>
+          <w:ilvl w:val="0"/>
+          <w:numId w:val="29"/>
+        </w:numPr>
+        <w:tabs>
+          <w:tab w:val="left" w:pos="360"/>
+          <w:tab w:val="left" w:pos="1440"/>
+          <w:tab w:val="left" w:pos="5760"/>
+          <w:tab w:val="left" w:pos="7920"/>
+          <w:tab w:val="right" w:pos="11340"/>
+        </w:tabs>
+        <w:jc w:val="both"/>
+        <w:rPr>
+          <w:rFonts w:asciiTheme="minorHAnsi" w:hAnsiTheme="minorHAnsi" w:cs="Arial"/>
+          <w:iCs/>
+          <w:sz w:val="20"/>
+          <w:szCs w:val="20"/>
+        </w:rPr>
+      </w:pPr>
+      <w:r>
+        <w:rPr>
+          <w:rFonts w:asciiTheme="minorHAnsi" w:hAnsiTheme="minorHAnsi" w:cs="Arial"/>
+          <w:sz w:val="20"/>
+          <w:szCs w:val="20"/>
+          <w:lang w:eastAsia="ko-KR"/>
+        </w:rPr>
+        <w:t>Participated in three weeks of development, brainstorming and prototyping an item suitable for the topic</w:t>
+      </w:r>
+      <w:r>
+        <w:rPr>
+          <w:rFonts w:asciiTheme="minorHAnsi" w:hAnsiTheme="minorHAnsi" w:cs="Arial"/>
+          <w:sz w:val="20"/>
+          <w:szCs w:val="20"/>
+          <w:lang w:eastAsia="ko-KR"/>
+        </w:rPr>
+        <w:t xml:space="preserve"> using materials and equipment provided by </w:t>
+      </w:r>
+      <w:r>
+        <w:rPr>
+          <w:rFonts w:asciiTheme="minorHAnsi" w:hAnsiTheme="minorHAnsi" w:cs="Arial"/>
+          <w:sz w:val="20"/>
+          <w:szCs w:val="20"/>
+          <w:lang w:eastAsia="ko-KR"/>
+        </w:rPr>
+        <w:t xml:space="preserve">KAIST </w:t>
+      </w:r>
+      <w:r>
+        <w:rPr>
+          <w:rFonts w:asciiTheme="minorHAnsi" w:hAnsiTheme="minorHAnsi" w:cs="Arial"/>
+          <w:sz w:val="20"/>
+          <w:szCs w:val="20"/>
+          <w:lang w:eastAsia="ko-KR"/>
+        </w:rPr>
+        <w:t>makerspace</w:t>
+      </w:r>
+      <w:r>
+        <w:rPr>
+          <w:rFonts w:asciiTheme="minorHAnsi" w:hAnsiTheme="minorHAnsi" w:cs="Arial"/>
+          <w:sz w:val="20"/>
+          <w:szCs w:val="20"/>
+          <w:lang w:eastAsia="ko-KR"/>
+        </w:rPr>
+        <w:t>. Led a team of four as the leader and won the to</w:t>
+      </w:r>
+      <w:bookmarkStart w:id="0" w:name="_GoBack"/>
+      <w:bookmarkEnd w:id="0"/>
+      <w:r>
+        <w:rPr>
+          <w:rFonts w:asciiTheme="minorHAnsi" w:hAnsiTheme="minorHAnsi" w:cs="Arial"/>
+          <w:sz w:val="20"/>
+          <w:szCs w:val="20"/>
+          <w:lang w:eastAsia="ko-KR"/>
+        </w:rPr>
+        <w:t>p award with $2000.</w:t>
+      </w:r>
+    </w:p>
+    <w:p>
+      <w:pPr>
+        <w:pStyle w:val="ac"/>
+        <w:numPr>
+          <w:ilvl w:val="0"/>
+          <w:numId w:val="29"/>
+        </w:numPr>
+        <w:tabs>
+          <w:tab w:val="left" w:pos="360"/>
+          <w:tab w:val="left" w:pos="1440"/>
+          <w:tab w:val="left" w:pos="5760"/>
+          <w:tab w:val="left" w:pos="7920"/>
+          <w:tab w:val="right" w:pos="11340"/>
+        </w:tabs>
+        <w:jc w:val="both"/>
+        <w:rPr>
+          <w:rFonts w:asciiTheme="minorHAnsi" w:hAnsiTheme="minorHAnsi" w:cs="Arial"/>
+          <w:iCs/>
+          <w:sz w:val="20"/>
+          <w:szCs w:val="20"/>
+        </w:rPr>
+      </w:pPr>
+      <w:r>
+        <w:rPr>
+          <w:rFonts w:asciiTheme="minorHAnsi" w:hAnsiTheme="minorHAnsi" w:cs="Arial"/>
+          <w:iCs/>
+          <w:sz w:val="20"/>
+          <w:szCs w:val="20"/>
+        </w:rPr>
+        <w:t>Proposed an RFID token system to manage the expiration dates of food in refrigerators. Innovated the pre-existing RFID refrigerator system by installing an RFID reader on a token container instead of the refrigerator, which significantly decreased the cost and simplified the management algorithm.</w:t>
+      </w:r>
+    </w:p>
+    <w:p>
+      <w:pPr>
+        <w:pStyle w:val="ac"/>
+        <w:numPr>
+          <w:ilvl w:val="0"/>
+          <w:numId w:val="29"/>
+        </w:numPr>
+        <w:tabs>
+          <w:tab w:val="left" w:pos="360"/>
+          <w:tab w:val="left" w:pos="1440"/>
+          <w:tab w:val="left" w:pos="5760"/>
+          <w:tab w:val="left" w:pos="7920"/>
+          <w:tab w:val="right" w:pos="11340"/>
+        </w:tabs>
+        <w:jc w:val="both"/>
+        <w:rPr>
+          <w:rFonts w:asciiTheme="minorHAnsi" w:hAnsiTheme="minorHAnsi" w:cs="Arial"/>
+          <w:iCs/>
+          <w:sz w:val="20"/>
+          <w:szCs w:val="20"/>
+        </w:rPr>
+      </w:pPr>
+      <w:r>
+        <w:rPr>
+          <w:rFonts w:asciiTheme="minorHAnsi" w:hAnsiTheme="minorHAnsi" w:cs="Arial"/>
+          <w:iCs/>
+          <w:sz w:val="20"/>
+          <w:szCs w:val="20"/>
+        </w:rPr>
+        <w:t>Managed the team through difficult times, changing the item three times during the three weeks. Took charge of the entire software coding process using C# UWP.</w:t>
+      </w:r>
+    </w:p>
+    <w:p>
+      <w:pPr>
+        <w:tabs>
+          <w:tab w:val="left" w:pos="360"/>
+          <w:tab w:val="left" w:pos="1440"/>
+          <w:tab w:val="left" w:pos="5760"/>
+          <w:tab w:val="left" w:pos="7920"/>
+          <w:tab w:val="right" w:pos="11340"/>
+        </w:tabs>
+        <w:jc w:val="both"/>
+        <w:rPr>
+          <w:rFonts w:asciiTheme="minorHAnsi" w:hAnsiTheme="minorHAnsi" w:cs="Arial"/>
+          <w:b/>
+          <w:iCs/>
+          <w:sz w:val="20"/>
+          <w:szCs w:val="20"/>
+          <w:lang w:eastAsia="ko-KR"/>
+        </w:rPr>
+      </w:pPr>
+    </w:p>
+    <w:p>
+      <w:pPr>
+        <w:tabs>
+          <w:tab w:val="left" w:pos="360"/>
+          <w:tab w:val="left" w:pos="1440"/>
+          <w:tab w:val="left" w:pos="5760"/>
+          <w:tab w:val="left" w:pos="7920"/>
+          <w:tab w:val="right" w:pos="11340"/>
+        </w:tabs>
+        <w:jc w:val="both"/>
+        <w:rPr>
+          <w:rFonts w:asciiTheme="minorHAnsi" w:hAnsiTheme="minorHAnsi" w:cs="Arial"/>
+          <w:b/>
+          <w:iCs/>
+          <w:sz w:val="20"/>
+          <w:szCs w:val="20"/>
+          <w:lang w:eastAsia="ko-KR"/>
+        </w:rPr>
+      </w:pPr>
+      <w:r>
+        <w:rPr>
+          <w:rFonts w:asciiTheme="minorHAnsi" w:hAnsiTheme="minorHAnsi" w:cs="Arial" w:hint="eastAsia"/>
+          <w:b/>
+          <w:iCs/>
+          <w:sz w:val="20"/>
+          <w:szCs w:val="20"/>
+          <w:lang w:eastAsia="ko-KR"/>
+        </w:rPr>
+        <w:t>G</w:t>
+      </w:r>
+      <w:r>
+        <w:rPr>
+          <w:rFonts w:asciiTheme="minorHAnsi" w:hAnsiTheme="minorHAnsi" w:cs="Arial"/>
+          <w:b/>
+          <w:iCs/>
+          <w:sz w:val="20"/>
+          <w:szCs w:val="20"/>
+          <w:lang w:eastAsia="ko-KR"/>
+        </w:rPr>
+        <w:t xml:space="preserve">eorgia Institute of Technology </w:t>
+      </w:r>
+      <w:r>
+        <w:rPr>
+          <w:rFonts w:asciiTheme="minorHAnsi" w:hAnsiTheme="minorHAnsi" w:cs="Arial"/>
+          <w:b/>
+          <w:iCs/>
+          <w:sz w:val="20"/>
+          <w:szCs w:val="20"/>
+        </w:rPr>
+        <w:t xml:space="preserve">| </w:t>
+      </w:r>
+      <w:r>
+        <w:rPr>
+          <w:rFonts w:asciiTheme="minorHAnsi" w:hAnsiTheme="minorHAnsi" w:cs="Arial"/>
+          <w:b/>
+          <w:iCs/>
+          <w:sz w:val="20"/>
+          <w:szCs w:val="20"/>
+        </w:rPr>
+        <w:t>Atlanta, GA</w:t>
+      </w:r>
+    </w:p>
+    <w:p>
+      <w:pPr>
+        <w:tabs>
+          <w:tab w:val="left" w:pos="360"/>
+          <w:tab w:val="left" w:pos="1440"/>
+          <w:tab w:val="left" w:pos="5760"/>
+          <w:tab w:val="left" w:pos="7920"/>
+          <w:tab w:val="right" w:pos="11340"/>
+        </w:tabs>
+        <w:jc w:val="both"/>
+        <w:rPr>
+          <w:rFonts w:asciiTheme="minorHAnsi" w:hAnsiTheme="minorHAnsi" w:cs="Arial"/>
+          <w:b/>
+          <w:iCs/>
+          <w:sz w:val="20"/>
+          <w:szCs w:val="20"/>
+        </w:rPr>
+      </w:pPr>
+      <w:r>
+        <w:rPr>
+          <w:rFonts w:asciiTheme="minorHAnsi" w:hAnsiTheme="minorHAnsi" w:cs="Arial"/>
+          <w:b/>
+          <w:iCs/>
+          <w:sz w:val="20"/>
+          <w:szCs w:val="20"/>
+        </w:rPr>
+        <w:t>Senior Design Project: Plant Physiology</w:t>
+      </w:r>
+      <w:r>
+        <w:rPr>
+          <w:rFonts w:asciiTheme="minorHAnsi" w:hAnsiTheme="minorHAnsi" w:cs="Arial"/>
+          <w:b/>
+          <w:iCs/>
+          <w:sz w:val="20"/>
+          <w:szCs w:val="20"/>
+        </w:rPr>
+        <w:t xml:space="preserve"> [</w:t>
+      </w:r>
+      <w:hyperlink r:id="rId9" w:history="1">
+        <w:r>
+          <w:rPr>
+            <w:rStyle w:val="a3"/>
+            <w:rFonts w:asciiTheme="minorHAnsi" w:hAnsiTheme="minorHAnsi" w:cs="Arial"/>
+            <w:b/>
+            <w:iCs/>
+            <w:sz w:val="20"/>
+            <w:szCs w:val="20"/>
+          </w:rPr>
+          <w:t>lin</w:t>
+        </w:r>
+        <w:r>
+          <w:rPr>
+            <w:rStyle w:val="a3"/>
+            <w:rFonts w:asciiTheme="minorHAnsi" w:hAnsiTheme="minorHAnsi" w:cs="Arial"/>
+            <w:b/>
+            <w:iCs/>
+            <w:sz w:val="20"/>
+            <w:szCs w:val="20"/>
+          </w:rPr>
+          <w:t>k</w:t>
+        </w:r>
+      </w:hyperlink>
+      <w:r>
+        <w:rPr>
+          <w:rFonts w:asciiTheme="minorHAnsi" w:hAnsiTheme="minorHAnsi" w:cs="Arial"/>
+          <w:b/>
+          <w:iCs/>
+          <w:sz w:val="20"/>
+          <w:szCs w:val="20"/>
+        </w:rPr>
+        <w:t>]</w:t>
+      </w:r>
+      <w:r>
+        <w:rPr>
+          <w:rFonts w:asciiTheme="minorHAnsi" w:hAnsiTheme="minorHAnsi" w:cs="Arial"/>
+          <w:i/>
+          <w:iCs/>
+          <w:sz w:val="20"/>
+          <w:szCs w:val="20"/>
+        </w:rPr>
+        <w:tab/>
+      </w:r>
+      <w:r>
+        <w:rPr>
+          <w:rFonts w:asciiTheme="minorHAnsi" w:hAnsiTheme="minorHAnsi" w:cs="Arial"/>
+          <w:i/>
+          <w:iCs/>
+          <w:sz w:val="20"/>
+          <w:szCs w:val="20"/>
+        </w:rPr>
+        <w:tab/>
+      </w:r>
+      <w:r>
+        <w:rPr>
+          <w:rFonts w:asciiTheme="minorHAnsi" w:hAnsiTheme="minorHAnsi" w:cs="Arial"/>
+          <w:i/>
+          <w:iCs/>
+          <w:sz w:val="20"/>
+          <w:szCs w:val="20"/>
+        </w:rPr>
+        <w:tab/>
+      </w:r>
+      <w:r>
+        <w:rPr>
+          <w:rFonts w:asciiTheme="minorHAnsi" w:hAnsiTheme="minorHAnsi" w:cs="Arial"/>
+          <w:i/>
+          <w:iCs/>
+          <w:sz w:val="20"/>
+          <w:szCs w:val="20"/>
+        </w:rPr>
         <w:t>Spring</w:t>
       </w:r>
       <w:r>
@@ -1067,17 +1486,7 @@
           <w:sz w:val="20"/>
           <w:szCs w:val="20"/>
         </w:rPr>
-        <w:t>2</w:t>
-      </w:r>
-      <w:r>
-        <w:rPr>
-          <w:rFonts w:asciiTheme="minorHAnsi" w:hAnsiTheme="minorHAnsi" w:cs="Arial"/>
-          <w:i/>
-          <w:iCs/>
-          <w:sz w:val="20"/>
-          <w:szCs w:val="20"/>
-        </w:rPr>
-        <w:t>4</w:t>
+        <w:t>24</w:t>
       </w:r>
     </w:p>
     <w:p>
@@ -1129,17 +1538,7 @@
           <w:sz w:val="20"/>
           <w:szCs w:val="20"/>
         </w:rPr>
-        <w:t xml:space="preserve">, a Swiss agriculture company. Successfully closed the flytrap using only electrical </w:t>
-      </w:r>
-      <w:proofErr w:type="spellStart"/>
-      <w:r>
-        <w:rPr>
-          <w:rFonts w:asciiTheme="minorHAnsi" w:hAnsiTheme="minorHAnsi" w:cs="Arial"/>
-          <w:iCs/>
-          <w:sz w:val="20"/>
-          <w:szCs w:val="20"/>
-        </w:rPr>
-        <w:t>signals.</w:t>
+        <w:t>, a Swiss agriculture company. Successfully closed the flytrap using only electrical signals.</w:t>
       </w:r>
     </w:p>
     <w:p>
@@ -1164,7 +1563,6 @@
           <w:szCs w:val="20"/>
         </w:rPr>
       </w:pPr>
-      <w:proofErr w:type="spellEnd"/>
       <w:r>
         <w:rPr>
           <w:rFonts w:asciiTheme="minorHAnsi" w:hAnsiTheme="minorHAnsi" w:cs="Arial"/>
@@ -1398,6 +1796,39 @@
       <w:r>
         <w:rPr>
           <w:rFonts w:asciiTheme="minorHAnsi" w:hAnsiTheme="minorHAnsi" w:cs="Arial"/>
+          <w:b/>
+          <w:iCs/>
+          <w:sz w:val="20"/>
+          <w:szCs w:val="20"/>
+        </w:rPr>
+        <w:t xml:space="preserve"> [</w:t>
+      </w:r>
+      <w:hyperlink r:id="rId10" w:history="1">
+        <w:r>
+          <w:rPr>
+            <w:rStyle w:val="a3"/>
+            <w:rFonts w:asciiTheme="minorHAnsi" w:hAnsiTheme="minorHAnsi" w:cs="Arial"/>
+            <w:b/>
+            <w:iCs/>
+            <w:sz w:val="20"/>
+            <w:szCs w:val="20"/>
+          </w:rPr>
+          <w:t>link</w:t>
+        </w:r>
+      </w:hyperlink>
+      <w:r>
+        <w:rPr>
+          <w:rFonts w:asciiTheme="minorHAnsi" w:hAnsiTheme="minorHAnsi" w:cs="Arial"/>
+          <w:b/>
+          <w:iCs/>
+          <w:sz w:val="20"/>
+          <w:szCs w:val="20"/>
+        </w:rPr>
+        <w:t>]</w:t>
+      </w:r>
+      <w:r>
+        <w:rPr>
+          <w:rFonts w:asciiTheme="minorHAnsi" w:hAnsiTheme="minorHAnsi" w:cs="Arial"/>
           <w:i/>
           <w:iCs/>
           <w:sz w:val="20"/>
@@ -1752,6 +2183,50 @@
         </w:rPr>
         <w:t xml:space="preserve"> Engineer</w:t>
       </w:r>
+      <w:r>
+        <w:rPr>
+          <w:rFonts w:asciiTheme="minorHAnsi" w:hAnsiTheme="minorHAnsi" w:cs="Arial"/>
+          <w:b/>
+          <w:i/>
+          <w:iCs/>
+          <w:sz w:val="20"/>
+          <w:szCs w:val="20"/>
+        </w:rPr>
+        <w:t xml:space="preserve"> </w:t>
+      </w:r>
+      <w:r>
+        <w:rPr>
+          <w:rFonts w:asciiTheme="minorHAnsi" w:hAnsiTheme="minorHAnsi" w:cs="Arial"/>
+          <w:b/>
+          <w:iCs/>
+          <w:sz w:val="20"/>
+          <w:szCs w:val="20"/>
+        </w:rPr>
+        <w:t>[</w:t>
+      </w:r>
+      <w:hyperlink r:id="rId11" w:history="1">
+        <w:r>
+          <w:rPr>
+            <w:rStyle w:val="a3"/>
+            <w:rFonts w:asciiTheme="minorHAnsi" w:hAnsiTheme="minorHAnsi" w:cs="Arial"/>
+            <w:b/>
+            <w:iCs/>
+            <w:sz w:val="20"/>
+            <w:szCs w:val="20"/>
+          </w:rPr>
+          <w:t>link</w:t>
+        </w:r>
+      </w:hyperlink>
+      <w:r>
+        <w:rPr>
+          <w:rFonts w:asciiTheme="minorHAnsi" w:hAnsiTheme="minorHAnsi" w:cs="Arial"/>
+          <w:b/>
+          <w:iCs/>
+          <w:sz w:val="20"/>
+          <w:szCs w:val="20"/>
+        </w:rPr>
+        <w:t>]</w:t>
+      </w:r>
     </w:p>
     <w:p>
       <w:pPr>
@@ -2453,6 +2928,7 @@
           <w:iCs/>
           <w:u w:val="single"/>
         </w:rPr>
+        <w:lastRenderedPageBreak/>
         <w:t>T</w:t>
       </w:r>
       <w:r>
@@ -2683,16 +3159,7 @@
           <w:sz w:val="20"/>
           <w:szCs w:val="20"/>
         </w:rPr>
-        <w:t>Tutored two freshmen for ‘Introduction to Programming’</w:t>
-      </w:r>
-      <w:r>
-        <w:rPr>
-          <w:rFonts w:asciiTheme="minorHAnsi" w:hAnsiTheme="minorHAnsi" w:cs="Arial"/>
-          <w:iCs/>
-          <w:sz w:val="20"/>
-          <w:szCs w:val="20"/>
-        </w:rPr>
-        <w:t xml:space="preserve"> 4 hours a week. Paid 25,000 won per hours.</w:t>
+        <w:t>Tutored two freshmen for ‘Introduction to Programming’ 4 hours a week. Paid 25,000 won per hours.</w:t>
       </w:r>
     </w:p>
     <w:p>
@@ -3068,7 +3535,6 @@
           <w:szCs w:val="20"/>
           <w:lang w:eastAsia="ko-KR"/>
         </w:rPr>
-        <w:lastRenderedPageBreak/>
         <w:t>G</w:t>
       </w:r>
       <w:r>
@@ -3128,17 +3594,7 @@
           <w:sz w:val="20"/>
           <w:szCs w:val="20"/>
         </w:rPr>
-        <w:t>ECE</w:t>
-      </w:r>
-      <w:r>
-        <w:rPr>
-          <w:rFonts w:asciiTheme="minorHAnsi" w:hAnsiTheme="minorHAnsi" w:cs="Arial"/>
-          <w:b/>
-          <w:iCs/>
-          <w:sz w:val="20"/>
-          <w:szCs w:val="20"/>
-        </w:rPr>
-        <w:t xml:space="preserve"> Tutor</w:t>
+        <w:t>ECE Tutor</w:t>
       </w:r>
       <w:r>
         <w:rPr>
@@ -3238,16 +3694,7 @@
           <w:sz w:val="20"/>
           <w:szCs w:val="20"/>
         </w:rPr>
-        <w:t>Managed the tutoring sections</w:t>
-      </w:r>
-      <w:r>
-        <w:rPr>
-          <w:rFonts w:asciiTheme="minorHAnsi" w:hAnsiTheme="minorHAnsi" w:cs="Arial"/>
-          <w:iCs/>
-          <w:sz w:val="20"/>
-          <w:szCs w:val="20"/>
-        </w:rPr>
-        <w:t xml:space="preserve"> </w:t>
+        <w:t xml:space="preserve">Managed the tutoring sections </w:t>
       </w:r>
       <w:r>
         <w:rPr>
@@ -3267,8 +3714,6 @@
         </w:rPr>
         <w:t>C</w:t>
       </w:r>
-      <w:bookmarkStart w:id="0" w:name="_GoBack"/>
-      <w:bookmarkEnd w:id="0"/>
       <w:r>
         <w:rPr>
           <w:rFonts w:asciiTheme="minorHAnsi" w:hAnsiTheme="minorHAnsi" w:cs="Arial"/>
@@ -3821,26 +4266,16 @@
           <w:sz w:val="20"/>
           <w:szCs w:val="20"/>
         </w:rPr>
-        <w:t>Linear Algebra</w:t>
-      </w:r>
-      <w:r>
-        <w:rPr>
-          <w:rFonts w:asciiTheme="minorHAnsi" w:hAnsiTheme="minorHAnsi" w:cs="Arial"/>
-          <w:b/>
-          <w:iCs/>
-          <w:sz w:val="20"/>
-          <w:szCs w:val="20"/>
-        </w:rPr>
-        <w:t xml:space="preserve">:  </w:t>
-      </w:r>
-      <w:r>
-        <w:rPr>
-          <w:rFonts w:asciiTheme="minorHAnsi" w:hAnsiTheme="minorHAnsi" w:cs="Arial"/>
-          <w:iCs/>
-          <w:sz w:val="20"/>
-          <w:szCs w:val="20"/>
-        </w:rPr>
-        <w:t>Eigenvalue/vector; Diagonalization; Jordan Rational Form; Spectral Theorem; Characteristic/Minimal Polynomial;</w:t>
+        <w:t xml:space="preserve">Communication Engineering: </w:t>
+      </w:r>
+      <w:r>
+        <w:rPr>
+          <w:rFonts w:asciiTheme="minorHAnsi" w:hAnsiTheme="minorHAnsi" w:cs="Arial"/>
+          <w:iCs/>
+          <w:sz w:val="20"/>
+          <w:szCs w:val="20"/>
+        </w:rPr>
+        <w:t>MAP, Viterbi Algorithm, ISI Channels, OFDM, Waveform Shaping</w:t>
       </w:r>
     </w:p>
     <w:p>
@@ -3854,13 +4289,40 @@
         </w:tabs>
         <w:rPr>
           <w:rFonts w:asciiTheme="minorHAnsi" w:hAnsiTheme="minorHAnsi" w:cs="Arial"/>
-          <w:b/>
-          <w:iCs/>
-          <w:sz w:val="20"/>
-          <w:szCs w:val="20"/>
-          <w:lang w:eastAsia="ko-KR"/>
-        </w:rPr>
-      </w:pPr>
+          <w:iCs/>
+          <w:sz w:val="20"/>
+          <w:szCs w:val="20"/>
+        </w:rPr>
+      </w:pPr>
+      <w:r>
+        <w:rPr>
+          <w:rFonts w:asciiTheme="minorHAnsi" w:hAnsiTheme="minorHAnsi" w:cs="Arial"/>
+          <w:b/>
+          <w:iCs/>
+          <w:sz w:val="20"/>
+          <w:szCs w:val="20"/>
+        </w:rPr>
+        <w:t>Linear Algebra</w:t>
+      </w:r>
+      <w:r>
+        <w:rPr>
+          <w:rFonts w:asciiTheme="minorHAnsi" w:hAnsiTheme="minorHAnsi" w:cs="Arial"/>
+          <w:b/>
+          <w:iCs/>
+          <w:sz w:val="20"/>
+          <w:szCs w:val="20"/>
+        </w:rPr>
+        <w:t xml:space="preserve">:  </w:t>
+      </w:r>
+      <w:r>
+        <w:rPr>
+          <w:rFonts w:asciiTheme="minorHAnsi" w:hAnsiTheme="minorHAnsi" w:cs="Arial"/>
+          <w:iCs/>
+          <w:sz w:val="20"/>
+          <w:szCs w:val="20"/>
+        </w:rPr>
+        <w:t>Eigenvalue/vector; Diagonalization; Jordan Rational Form; Spectral Theorem; Characteristic/Minimal Polynomial;</w:t>
+      </w:r>
     </w:p>
     <w:p>
       <w:pPr>
@@ -3880,48 +4342,6 @@
           <w:lang w:eastAsia="ko-KR"/>
         </w:rPr>
       </w:pPr>
-      <w:r>
-        <w:rPr>
-          <w:rFonts w:asciiTheme="minorHAnsi" w:hAnsiTheme="minorHAnsi" w:cs="Arial" w:hint="eastAsia"/>
-          <w:b/>
-          <w:iCs/>
-          <w:sz w:val="20"/>
-          <w:szCs w:val="20"/>
-          <w:lang w:eastAsia="ko-KR"/>
-        </w:rPr>
-        <w:t>G</w:t>
-      </w:r>
-      <w:r>
-        <w:rPr>
-          <w:rFonts w:asciiTheme="minorHAnsi" w:hAnsiTheme="minorHAnsi" w:cs="Arial"/>
-          <w:b/>
-          <w:iCs/>
-          <w:sz w:val="20"/>
-          <w:szCs w:val="20"/>
-          <w:lang w:eastAsia="ko-KR"/>
-        </w:rPr>
-        <w:t xml:space="preserve">eorgia Institute of Technology </w:t>
-      </w:r>
-      <w:r>
-        <w:rPr>
-          <w:rFonts w:asciiTheme="minorHAnsi" w:hAnsiTheme="minorHAnsi" w:cs="Arial"/>
-          <w:b/>
-          <w:iCs/>
-          <w:sz w:val="20"/>
-          <w:szCs w:val="20"/>
-        </w:rPr>
-        <w:t xml:space="preserve">| </w:t>
-      </w:r>
-      <w:r>
-        <w:rPr>
-          <w:rFonts w:asciiTheme="minorHAnsi" w:hAnsiTheme="minorHAnsi" w:cs="Arial"/>
-          <w:b/>
-          <w:iCs/>
-          <w:sz w:val="20"/>
-          <w:szCs w:val="20"/>
-        </w:rPr>
-        <w:t>Atlanta, GA</w:t>
-      </w:r>
     </w:p>
     <w:p>
       <w:pPr>
@@ -3934,6 +4354,7 @@
         </w:tabs>
         <w:rPr>
           <w:rFonts w:asciiTheme="minorHAnsi" w:hAnsiTheme="minorHAnsi" w:cs="Arial"/>
+          <w:b/>
           <w:iCs/>
           <w:sz w:val="20"/>
           <w:szCs w:val="20"/>
@@ -3949,7 +4370,7 @@
           <w:szCs w:val="20"/>
           <w:lang w:eastAsia="ko-KR"/>
         </w:rPr>
-        <w:t>F</w:t>
+        <w:t>G</w:t>
       </w:r>
       <w:r>
         <w:rPr>
@@ -3960,127 +4381,27 @@
           <w:szCs w:val="20"/>
           <w:lang w:eastAsia="ko-KR"/>
         </w:rPr>
-        <w:t>undamental of DSP</w:t>
-      </w:r>
-      <w:r>
-        <w:rPr>
-          <w:rFonts w:asciiTheme="minorHAnsi" w:hAnsiTheme="minorHAnsi" w:cs="Arial"/>
-          <w:iCs/>
-          <w:sz w:val="20"/>
-          <w:szCs w:val="20"/>
-          <w:lang w:eastAsia="ko-KR"/>
-        </w:rPr>
-        <w:t>: DFT</w:t>
-      </w:r>
-      <w:r>
-        <w:rPr>
-          <w:rFonts w:asciiTheme="minorHAnsi" w:hAnsiTheme="minorHAnsi" w:cs="Arial"/>
-          <w:iCs/>
-          <w:sz w:val="20"/>
-          <w:szCs w:val="20"/>
-          <w:lang w:eastAsia="ko-KR"/>
-        </w:rPr>
-        <w:t>,</w:t>
-      </w:r>
-      <w:r>
-        <w:rPr>
-          <w:rFonts w:asciiTheme="minorHAnsi" w:hAnsiTheme="minorHAnsi" w:cs="Arial"/>
-          <w:iCs/>
-          <w:sz w:val="20"/>
-          <w:szCs w:val="20"/>
-          <w:lang w:eastAsia="ko-KR"/>
-        </w:rPr>
-        <w:t xml:space="preserve"> </w:t>
-      </w:r>
-      <w:r>
-        <w:rPr>
-          <w:rFonts w:asciiTheme="minorHAnsi" w:hAnsiTheme="minorHAnsi" w:cs="Arial"/>
-          <w:iCs/>
-          <w:sz w:val="20"/>
-          <w:szCs w:val="20"/>
-          <w:lang w:eastAsia="ko-KR"/>
-        </w:rPr>
-        <w:t>Overlap Add/Save</w:t>
-      </w:r>
-      <w:r>
-        <w:rPr>
-          <w:rFonts w:asciiTheme="minorHAnsi" w:hAnsiTheme="minorHAnsi" w:cs="Arial"/>
-          <w:iCs/>
-          <w:sz w:val="20"/>
-          <w:szCs w:val="20"/>
-          <w:lang w:eastAsia="ko-KR"/>
-        </w:rPr>
-        <w:t>,</w:t>
-      </w:r>
-      <w:r>
-        <w:rPr>
-          <w:rFonts w:asciiTheme="minorHAnsi" w:hAnsiTheme="minorHAnsi" w:cs="Arial"/>
-          <w:iCs/>
-          <w:sz w:val="20"/>
-          <w:szCs w:val="20"/>
-          <w:lang w:eastAsia="ko-KR"/>
-        </w:rPr>
-        <w:t xml:space="preserve"> </w:t>
-      </w:r>
-      <w:r>
-        <w:rPr>
-          <w:rFonts w:asciiTheme="minorHAnsi" w:hAnsiTheme="minorHAnsi" w:cs="Arial"/>
-          <w:iCs/>
-          <w:sz w:val="20"/>
-          <w:szCs w:val="20"/>
-          <w:lang w:eastAsia="ko-KR"/>
-        </w:rPr>
-        <w:t>FFT &amp; IFFT Algorithm</w:t>
-      </w:r>
-      <w:r>
-        <w:rPr>
-          <w:rFonts w:asciiTheme="minorHAnsi" w:hAnsiTheme="minorHAnsi" w:cs="Arial"/>
-          <w:iCs/>
-          <w:sz w:val="20"/>
-          <w:szCs w:val="20"/>
-          <w:lang w:eastAsia="ko-KR"/>
-        </w:rPr>
-        <w:t>,</w:t>
-      </w:r>
-      <w:r>
-        <w:rPr>
-          <w:rFonts w:asciiTheme="minorHAnsi" w:hAnsiTheme="minorHAnsi" w:cs="Arial"/>
-          <w:iCs/>
-          <w:sz w:val="20"/>
-          <w:szCs w:val="20"/>
-          <w:lang w:eastAsia="ko-KR"/>
-        </w:rPr>
-        <w:t xml:space="preserve"> </w:t>
-      </w:r>
-      <w:r>
-        <w:rPr>
-          <w:rFonts w:asciiTheme="minorHAnsi" w:hAnsiTheme="minorHAnsi" w:cs="Arial"/>
-          <w:iCs/>
-          <w:sz w:val="20"/>
-          <w:szCs w:val="20"/>
-          <w:lang w:eastAsia="ko-KR"/>
-        </w:rPr>
-        <w:t>Kaiser Window</w:t>
-      </w:r>
-      <w:r>
-        <w:rPr>
-          <w:rFonts w:asciiTheme="minorHAnsi" w:hAnsiTheme="minorHAnsi" w:cs="Arial"/>
-          <w:iCs/>
-          <w:sz w:val="20"/>
-          <w:szCs w:val="20"/>
-          <w:lang w:eastAsia="ko-KR"/>
-        </w:rPr>
-        <w:t>,</w:t>
-      </w:r>
-      <w:r>
-        <w:rPr>
-          <w:rFonts w:asciiTheme="minorHAnsi" w:hAnsiTheme="minorHAnsi" w:cs="Arial"/>
-          <w:iCs/>
-          <w:sz w:val="20"/>
-          <w:szCs w:val="20"/>
-          <w:lang w:eastAsia="ko-KR"/>
-        </w:rPr>
-        <w:t xml:space="preserve"> PCA</w:t>
+        <w:t xml:space="preserve">eorgia Institute of Technology </w:t>
+      </w:r>
+      <w:r>
+        <w:rPr>
+          <w:rFonts w:asciiTheme="minorHAnsi" w:hAnsiTheme="minorHAnsi" w:cs="Arial"/>
+          <w:b/>
+          <w:iCs/>
+          <w:sz w:val="20"/>
+          <w:szCs w:val="20"/>
+        </w:rPr>
+        <w:t xml:space="preserve">| </w:t>
+      </w:r>
+      <w:r>
+        <w:rPr>
+          <w:rFonts w:asciiTheme="minorHAnsi" w:hAnsiTheme="minorHAnsi" w:cs="Arial"/>
+          <w:b/>
+          <w:iCs/>
+          <w:sz w:val="20"/>
+          <w:szCs w:val="20"/>
+        </w:rPr>
+        <w:t>Atlanta, GA</w:t>
       </w:r>
     </w:p>
     <w:p>
@@ -4109,7 +4430,7 @@
           <w:szCs w:val="20"/>
           <w:lang w:eastAsia="ko-KR"/>
         </w:rPr>
-        <w:t>R</w:t>
+        <w:t>F</w:t>
       </w:r>
       <w:r>
         <w:rPr>
@@ -4120,7 +4441,7 @@
           <w:szCs w:val="20"/>
           <w:lang w:eastAsia="ko-KR"/>
         </w:rPr>
-        <w:t>andom Signal Processing and Its Application</w:t>
+        <w:t>undamental of DSP</w:t>
       </w:r>
       <w:r>
         <w:rPr>
@@ -4130,7 +4451,7 @@
           <w:szCs w:val="20"/>
           <w:lang w:eastAsia="ko-KR"/>
         </w:rPr>
-        <w:t>: MMSE</w:t>
+        <w:t>: DFT</w:t>
       </w:r>
       <w:r>
         <w:rPr>
@@ -4150,7 +4471,7 @@
           <w:szCs w:val="20"/>
           <w:lang w:eastAsia="ko-KR"/>
         </w:rPr>
-        <w:t xml:space="preserve"> MVUE</w:t>
+        <w:t xml:space="preserve"> </w:t>
       </w:r>
       <w:r>
         <w:rPr>
@@ -4160,6 +4481,16 @@
           <w:szCs w:val="20"/>
           <w:lang w:eastAsia="ko-KR"/>
         </w:rPr>
+        <w:t>Overlap Add/Save</w:t>
+      </w:r>
+      <w:r>
+        <w:rPr>
+          <w:rFonts w:asciiTheme="minorHAnsi" w:hAnsiTheme="minorHAnsi" w:cs="Arial"/>
+          <w:iCs/>
+          <w:sz w:val="20"/>
+          <w:szCs w:val="20"/>
+          <w:lang w:eastAsia="ko-KR"/>
+        </w:rPr>
         <w:t>,</w:t>
       </w:r>
       <w:r>
@@ -4170,7 +4501,7 @@
           <w:szCs w:val="20"/>
           <w:lang w:eastAsia="ko-KR"/>
         </w:rPr>
-        <w:t xml:space="preserve"> MLE</w:t>
+        <w:t xml:space="preserve"> </w:t>
       </w:r>
       <w:r>
         <w:rPr>
@@ -4180,6 +4511,16 @@
           <w:szCs w:val="20"/>
           <w:lang w:eastAsia="ko-KR"/>
         </w:rPr>
+        <w:t>FFT &amp; IFFT Algorithm</w:t>
+      </w:r>
+      <w:r>
+        <w:rPr>
+          <w:rFonts w:asciiTheme="minorHAnsi" w:hAnsiTheme="minorHAnsi" w:cs="Arial"/>
+          <w:iCs/>
+          <w:sz w:val="20"/>
+          <w:szCs w:val="20"/>
+          <w:lang w:eastAsia="ko-KR"/>
+        </w:rPr>
         <w:t>,</w:t>
       </w:r>
       <w:r>
@@ -4190,7 +4531,7 @@
           <w:szCs w:val="20"/>
           <w:lang w:eastAsia="ko-KR"/>
         </w:rPr>
-        <w:t xml:space="preserve"> MoM Estimator</w:t>
+        <w:t xml:space="preserve"> </w:t>
       </w:r>
       <w:r>
         <w:rPr>
@@ -4200,6 +4541,16 @@
           <w:szCs w:val="20"/>
           <w:lang w:eastAsia="ko-KR"/>
         </w:rPr>
+        <w:t>Kaiser Window</w:t>
+      </w:r>
+      <w:r>
+        <w:rPr>
+          <w:rFonts w:asciiTheme="minorHAnsi" w:hAnsiTheme="minorHAnsi" w:cs="Arial"/>
+          <w:iCs/>
+          <w:sz w:val="20"/>
+          <w:szCs w:val="20"/>
+          <w:lang w:eastAsia="ko-KR"/>
+        </w:rPr>
         <w:t>,</w:t>
       </w:r>
       <w:r>
@@ -4210,47 +4561,7 @@
           <w:szCs w:val="20"/>
           <w:lang w:eastAsia="ko-KR"/>
         </w:rPr>
-        <w:t xml:space="preserve"> BLUE</w:t>
-      </w:r>
-      <w:r>
-        <w:rPr>
-          <w:rFonts w:asciiTheme="minorHAnsi" w:hAnsiTheme="minorHAnsi" w:cs="Arial"/>
-          <w:iCs/>
-          <w:sz w:val="20"/>
-          <w:szCs w:val="20"/>
-          <w:lang w:eastAsia="ko-KR"/>
-        </w:rPr>
-        <w:t>,</w:t>
-      </w:r>
-      <w:r>
-        <w:rPr>
-          <w:rFonts w:asciiTheme="minorHAnsi" w:hAnsiTheme="minorHAnsi" w:cs="Arial"/>
-          <w:iCs/>
-          <w:sz w:val="20"/>
-          <w:szCs w:val="20"/>
-          <w:lang w:eastAsia="ko-KR"/>
-        </w:rPr>
-        <w:t xml:space="preserve"> LLSE</w:t>
-      </w:r>
-      <w:r>
-        <w:rPr>
-          <w:rFonts w:asciiTheme="minorHAnsi" w:hAnsiTheme="minorHAnsi" w:cs="Arial"/>
-          <w:iCs/>
-          <w:sz w:val="20"/>
-          <w:szCs w:val="20"/>
-          <w:lang w:eastAsia="ko-KR"/>
-        </w:rPr>
-        <w:t>,</w:t>
-      </w:r>
-      <w:r>
-        <w:rPr>
-          <w:rFonts w:asciiTheme="minorHAnsi" w:hAnsiTheme="minorHAnsi" w:cs="Arial"/>
-          <w:iCs/>
-          <w:sz w:val="20"/>
-          <w:szCs w:val="20"/>
-          <w:lang w:eastAsia="ko-KR"/>
-        </w:rPr>
-        <w:t xml:space="preserve"> Markov Random Field</w:t>
+        <w:t xml:space="preserve"> PCA</w:t>
       </w:r>
     </w:p>
     <w:p>
@@ -4272,24 +4583,25 @@
       </w:pPr>
       <w:r>
         <w:rPr>
-          <w:rFonts w:asciiTheme="minorHAnsi" w:hAnsiTheme="minorHAnsi" w:cs="Arial"/>
+          <w:rFonts w:asciiTheme="minorHAnsi" w:hAnsiTheme="minorHAnsi" w:cs="Arial" w:hint="eastAsia"/>
           <w:b/>
           <w:iCs/>
           <w:sz w:val="20"/>
           <w:szCs w:val="20"/>
           <w:lang w:eastAsia="ko-KR"/>
         </w:rPr>
-        <w:t>Biosystems Analysis</w:t>
-      </w:r>
-      <w:r>
-        <w:rPr>
-          <w:rFonts w:asciiTheme="minorHAnsi" w:hAnsiTheme="minorHAnsi" w:cs="Arial"/>
+        <w:t>R</w:t>
+      </w:r>
+      <w:r>
+        <w:rPr>
+          <w:rFonts w:asciiTheme="minorHAnsi" w:hAnsiTheme="minorHAnsi" w:cs="Arial"/>
+          <w:b/>
           <w:iCs/>
           <w:sz w:val="20"/>
           <w:szCs w:val="20"/>
           <w:lang w:eastAsia="ko-KR"/>
         </w:rPr>
-        <w:t xml:space="preserve">: </w:t>
+        <w:t>andom Signal Processing and Its Application</w:t>
       </w:r>
       <w:r>
         <w:rPr>
@@ -4299,7 +4611,7 @@
           <w:szCs w:val="20"/>
           <w:lang w:eastAsia="ko-KR"/>
         </w:rPr>
-        <w:t xml:space="preserve">MLP, </w:t>
+        <w:t>: MMSE</w:t>
       </w:r>
       <w:r>
         <w:rPr>
@@ -4309,7 +4621,117 @@
           <w:szCs w:val="20"/>
           <w:lang w:eastAsia="ko-KR"/>
         </w:rPr>
-        <w:t>LSTM, Basic Cardiology</w:t>
+        <w:t>,</w:t>
+      </w:r>
+      <w:r>
+        <w:rPr>
+          <w:rFonts w:asciiTheme="minorHAnsi" w:hAnsiTheme="minorHAnsi" w:cs="Arial"/>
+          <w:iCs/>
+          <w:sz w:val="20"/>
+          <w:szCs w:val="20"/>
+          <w:lang w:eastAsia="ko-KR"/>
+        </w:rPr>
+        <w:t xml:space="preserve"> MVUE</w:t>
+      </w:r>
+      <w:r>
+        <w:rPr>
+          <w:rFonts w:asciiTheme="minorHAnsi" w:hAnsiTheme="minorHAnsi" w:cs="Arial"/>
+          <w:iCs/>
+          <w:sz w:val="20"/>
+          <w:szCs w:val="20"/>
+          <w:lang w:eastAsia="ko-KR"/>
+        </w:rPr>
+        <w:t>,</w:t>
+      </w:r>
+      <w:r>
+        <w:rPr>
+          <w:rFonts w:asciiTheme="minorHAnsi" w:hAnsiTheme="minorHAnsi" w:cs="Arial"/>
+          <w:iCs/>
+          <w:sz w:val="20"/>
+          <w:szCs w:val="20"/>
+          <w:lang w:eastAsia="ko-KR"/>
+        </w:rPr>
+        <w:t xml:space="preserve"> MLE</w:t>
+      </w:r>
+      <w:r>
+        <w:rPr>
+          <w:rFonts w:asciiTheme="minorHAnsi" w:hAnsiTheme="minorHAnsi" w:cs="Arial"/>
+          <w:iCs/>
+          <w:sz w:val="20"/>
+          <w:szCs w:val="20"/>
+          <w:lang w:eastAsia="ko-KR"/>
+        </w:rPr>
+        <w:t>,</w:t>
+      </w:r>
+      <w:r>
+        <w:rPr>
+          <w:rFonts w:asciiTheme="minorHAnsi" w:hAnsiTheme="minorHAnsi" w:cs="Arial"/>
+          <w:iCs/>
+          <w:sz w:val="20"/>
+          <w:szCs w:val="20"/>
+          <w:lang w:eastAsia="ko-KR"/>
+        </w:rPr>
+        <w:t xml:space="preserve"> MoM Estimator</w:t>
+      </w:r>
+      <w:r>
+        <w:rPr>
+          <w:rFonts w:asciiTheme="minorHAnsi" w:hAnsiTheme="minorHAnsi" w:cs="Arial"/>
+          <w:iCs/>
+          <w:sz w:val="20"/>
+          <w:szCs w:val="20"/>
+          <w:lang w:eastAsia="ko-KR"/>
+        </w:rPr>
+        <w:t>,</w:t>
+      </w:r>
+      <w:r>
+        <w:rPr>
+          <w:rFonts w:asciiTheme="minorHAnsi" w:hAnsiTheme="minorHAnsi" w:cs="Arial"/>
+          <w:iCs/>
+          <w:sz w:val="20"/>
+          <w:szCs w:val="20"/>
+          <w:lang w:eastAsia="ko-KR"/>
+        </w:rPr>
+        <w:t xml:space="preserve"> BLUE</w:t>
+      </w:r>
+      <w:r>
+        <w:rPr>
+          <w:rFonts w:asciiTheme="minorHAnsi" w:hAnsiTheme="minorHAnsi" w:cs="Arial"/>
+          <w:iCs/>
+          <w:sz w:val="20"/>
+          <w:szCs w:val="20"/>
+          <w:lang w:eastAsia="ko-KR"/>
+        </w:rPr>
+        <w:t>,</w:t>
+      </w:r>
+      <w:r>
+        <w:rPr>
+          <w:rFonts w:asciiTheme="minorHAnsi" w:hAnsiTheme="minorHAnsi" w:cs="Arial"/>
+          <w:iCs/>
+          <w:sz w:val="20"/>
+          <w:szCs w:val="20"/>
+          <w:lang w:eastAsia="ko-KR"/>
+        </w:rPr>
+        <w:t xml:space="preserve"> LLSE</w:t>
+      </w:r>
+      <w:r>
+        <w:rPr>
+          <w:rFonts w:asciiTheme="minorHAnsi" w:hAnsiTheme="minorHAnsi" w:cs="Arial"/>
+          <w:iCs/>
+          <w:sz w:val="20"/>
+          <w:szCs w:val="20"/>
+          <w:lang w:eastAsia="ko-KR"/>
+        </w:rPr>
+        <w:t>,</w:t>
+      </w:r>
+      <w:r>
+        <w:rPr>
+          <w:rFonts w:asciiTheme="minorHAnsi" w:hAnsiTheme="minorHAnsi" w:cs="Arial"/>
+          <w:iCs/>
+          <w:sz w:val="20"/>
+          <w:szCs w:val="20"/>
+          <w:lang w:eastAsia="ko-KR"/>
+        </w:rPr>
+        <w:t xml:space="preserve"> Markov Random Field</w:t>
       </w:r>
     </w:p>
     <w:p>
@@ -4337,38 +4759,17 @@
           <w:szCs w:val="20"/>
           <w:lang w:eastAsia="ko-KR"/>
         </w:rPr>
-        <w:t>Application</w:t>
-      </w:r>
-      <w:r>
-        <w:rPr>
-          <w:rFonts w:asciiTheme="minorHAnsi" w:hAnsiTheme="minorHAnsi" w:cs="Arial"/>
-          <w:b/>
+        <w:t>Application of DSP</w:t>
+      </w:r>
+      <w:r>
+        <w:rPr>
+          <w:rFonts w:asciiTheme="minorHAnsi" w:hAnsiTheme="minorHAnsi" w:cs="Arial"/>
           <w:iCs/>
           <w:sz w:val="20"/>
           <w:szCs w:val="20"/>
           <w:lang w:eastAsia="ko-KR"/>
         </w:rPr>
-        <w:t xml:space="preserve"> of DSP</w:t>
-      </w:r>
-      <w:r>
-        <w:rPr>
-          <w:rFonts w:asciiTheme="minorHAnsi" w:hAnsiTheme="minorHAnsi" w:cs="Arial"/>
-          <w:iCs/>
-          <w:sz w:val="20"/>
-          <w:szCs w:val="20"/>
-          <w:lang w:eastAsia="ko-KR"/>
-        </w:rPr>
-        <w:t xml:space="preserve">: </w:t>
-      </w:r>
-      <w:r>
-        <w:rPr>
-          <w:rFonts w:asciiTheme="minorHAnsi" w:hAnsiTheme="minorHAnsi" w:cs="Arial"/>
-          <w:iCs/>
-          <w:sz w:val="20"/>
-          <w:szCs w:val="20"/>
-          <w:lang w:eastAsia="ko-KR"/>
-        </w:rPr>
-        <w:t>AR model, Linear Predictor, Gray Code</w:t>
+        <w:t>: AR model, Linear Predictor, Gray Code</w:t>
       </w:r>
     </w:p>
     <w:p>
@@ -4531,7 +4932,7 @@
           <w:sz w:val="20"/>
           <w:szCs w:val="20"/>
         </w:rPr>
-        <w:t>, C++, C# WPF, MATLAB, Excel VBA, Verilog(beginner)</w:t>
+        <w:t>, C++, C#, MATLAB, Excel VBA, Verilog(beginner)</w:t>
       </w:r>
     </w:p>
     <w:p>
@@ -4660,34 +5061,7 @@
           <w:sz w:val="20"/>
           <w:szCs w:val="20"/>
         </w:rPr>
-        <w:t>Function Generator</w:t>
-      </w:r>
-      <w:r>
-        <w:rPr>
-          <w:rFonts w:asciiTheme="minorHAnsi" w:hAnsiTheme="minorHAnsi" w:cs="Arial"/>
-          <w:iCs/>
-          <w:sz w:val="20"/>
-          <w:szCs w:val="20"/>
-        </w:rPr>
-        <w:t>s</w:t>
-      </w:r>
-      <w:r>
-        <w:rPr>
-          <w:rFonts w:asciiTheme="minorHAnsi" w:hAnsiTheme="minorHAnsi" w:cs="Arial"/>
-          <w:iCs/>
-          <w:sz w:val="20"/>
-          <w:szCs w:val="20"/>
-        </w:rPr>
-        <w:t>,</w:t>
-      </w:r>
-      <w:r>
-        <w:rPr>
-          <w:rFonts w:asciiTheme="minorHAnsi" w:hAnsiTheme="minorHAnsi" w:cs="Arial"/>
-          <w:iCs/>
-          <w:sz w:val="20"/>
-          <w:szCs w:val="20"/>
-        </w:rPr>
-        <w:t xml:space="preserve"> </w:t>
+        <w:t xml:space="preserve">Function Generators, </w:t>
       </w:r>
       <w:proofErr w:type="spellStart"/>
       <w:r>
@@ -4707,16 +5081,7 @@
           <w:sz w:val="20"/>
           <w:szCs w:val="20"/>
         </w:rPr>
-        <w:t>,</w:t>
-      </w:r>
-      <w:r>
-        <w:rPr>
-          <w:rFonts w:asciiTheme="minorHAnsi" w:hAnsiTheme="minorHAnsi" w:cs="Arial"/>
-          <w:iCs/>
-          <w:sz w:val="20"/>
-          <w:szCs w:val="20"/>
-        </w:rPr>
-        <w:t xml:space="preserve"> ATmega128A, Xiao </w:t>
+        <w:t xml:space="preserve">, ATmega128A, Xiao </w:t>
       </w:r>
       <w:proofErr w:type="spellStart"/>
       <w:r>
@@ -4884,7 +5249,7 @@
       </w:pPr>
     </w:p>
     <w:sectPr>
-      <w:headerReference w:type="default" r:id="rId8"/>
+      <w:headerReference w:type="default" r:id="rId12"/>
       <w:pgSz w:w="12240" w:h="15840" w:code="1"/>
       <w:pgMar w:top="720" w:right="720" w:bottom="720" w:left="720" w:header="360" w:footer="706" w:gutter="0"/>
       <w:cols w:space="708"/>
@@ -8959,7 +9324,7 @@
   <w:style w:type="paragraph" w:default="1" w:styleId="a">
     <w:name w:val="Normal"/>
     <w:qFormat/>
-    <w:rsid w:val="00924108"/>
+    <w:rsid w:val="00161BD9"/>
     <w:rPr>
       <w:sz w:val="24"/>
       <w:szCs w:val="24"/>
@@ -9266,6 +9631,26 @@
       <w:contextualSpacing/>
     </w:pPr>
   </w:style>
+  <w:style w:type="character" w:styleId="ad">
+    <w:name w:val="Unresolved Mention"/>
+    <w:basedOn w:val="a0"/>
+    <w:rsid w:val="00041B04"/>
+    <w:rPr>
+      <w:color w:val="605E5C"/>
+      <w:shd w:val="clear" w:color="auto" w:fill="E1DFDD"/>
+    </w:rPr>
+  </w:style>
+  <w:style w:type="character" w:styleId="ae">
+    <w:name w:val="FollowedHyperlink"/>
+    <w:basedOn w:val="a0"/>
+    <w:semiHidden/>
+    <w:unhideWhenUsed/>
+    <w:rsid w:val="00041B04"/>
+    <w:rPr>
+      <w:color w:val="800080" w:themeColor="followedHyperlink"/>
+      <w:u w:val="single"/>
+    </w:rPr>
+  </w:style>
 </w:styles>
 </file>
 
@@ -9557,7 +9942,7 @@
 </file>
 
 <file path=customXml/itemProps1.xml><?xml version="1.0" encoding="utf-8"?>
-<ds:datastoreItem xmlns:ds="http://schemas.openxmlformats.org/officeDocument/2006/customXml" ds:itemID="{8044DF2F-F21A-455E-A00A-B14C305321DE}">
+<ds:datastoreItem xmlns:ds="http://schemas.openxmlformats.org/officeDocument/2006/customXml" ds:itemID="{7B4F78DA-C327-4D2E-9BA1-0E95D03874C4}">
   <ds:schemaRefs>
     <ds:schemaRef ds:uri="http://schemas.openxmlformats.org/officeDocument/2006/bibliography"/>
   </ds:schemaRefs>

</xml_diff>